<commit_message>
[20250826] Ajustes tarea 01
</commit_message>
<xml_diff>
--- a/03_Tareas y ejercicios/Tarea 01/Tarea 01.docx
+++ b/03_Tareas y ejercicios/Tarea 01/Tarea 01.docx
@@ -2354,7 +2354,97 @@
           <w:sz w:val="20"/>
           <w:szCs w:val="20"/>
         </w:rPr>
-        <w:t xml:space="preserve"> que se encuentra en la carpeta de la tarea 01 de Github. </w:t>
+        <w:t xml:space="preserve"> que se encuentra en la carpeta de la tarea 01 de Github</w:t>
+      </w:r>
+      <w:r>
+        <w:rPr>
+          <w:rFonts w:ascii="Segoe UI" w:hAnsi="Segoe UI" w:cs="Segoe UI"/>
+          <w:color w:val="000000"/>
+          <w:sz w:val="20"/>
+          <w:szCs w:val="20"/>
+        </w:rPr>
+        <w:t xml:space="preserve"> o en la siguiente liga: </w:t>
+      </w:r>
+      <w:r>
+        <w:rPr>
+          <w:rFonts w:ascii="Segoe UI" w:hAnsi="Segoe UI" w:cs="Segoe UI"/>
+          <w:color w:val="000000"/>
+          <w:sz w:val="20"/>
+          <w:szCs w:val="20"/>
+        </w:rPr>
+        <w:fldChar w:fldCharType="begin"/>
+      </w:r>
+      <w:r>
+        <w:rPr>
+          <w:rFonts w:ascii="Segoe UI" w:hAnsi="Segoe UI" w:cs="Segoe UI"/>
+          <w:color w:val="000000"/>
+          <w:sz w:val="20"/>
+          <w:szCs w:val="20"/>
+        </w:rPr>
+        <w:instrText>HYPERLINK "</w:instrText>
+      </w:r>
+      <w:r>
+        <w:rPr>
+          <w:rFonts w:ascii="Segoe UI" w:hAnsi="Segoe UI" w:cs="Segoe UI"/>
+          <w:color w:val="000000"/>
+          <w:sz w:val="20"/>
+          <w:szCs w:val="20"/>
+        </w:rPr>
+        <w:instrText>https://raw.githubusercontent.com/JuveCampos/TC2002B.651-Ciencia-de-datos/refs/heads/main/03_Tareas%20y%20ejercicios/Tarea%2001/datos_proyecciones_conapo_a_2070.csv</w:instrText>
+      </w:r>
+      <w:r>
+        <w:rPr>
+          <w:rFonts w:ascii="Segoe UI" w:hAnsi="Segoe UI" w:cs="Segoe UI"/>
+          <w:color w:val="000000"/>
+          <w:sz w:val="20"/>
+          <w:szCs w:val="20"/>
+        </w:rPr>
+        <w:instrText>"</w:instrText>
+      </w:r>
+      <w:r>
+        <w:rPr>
+          <w:rFonts w:ascii="Segoe UI" w:hAnsi="Segoe UI" w:cs="Segoe UI"/>
+          <w:color w:val="000000"/>
+          <w:sz w:val="20"/>
+          <w:szCs w:val="20"/>
+        </w:rPr>
+        <w:fldChar w:fldCharType="separate"/>
+      </w:r>
+      <w:r>
+        <w:rPr>
+          <w:rStyle w:val="Hipervnculo"/>
+          <w:rFonts w:ascii="Segoe UI" w:hAnsi="Segoe UI" w:cs="Segoe UI"/>
+          <w:sz w:val="20"/>
+          <w:szCs w:val="20"/>
+        </w:rPr>
+        <w:t>https://raw.githubusercontent.com/JuveCampos/TC2002B.651-Ciencia-de-datos/refs/heads/main/03_Tareas%20y%20ejercicios/Tarea%2001/datos_proyecciones_conapo_a_2070.csv</w:t>
+      </w:r>
+      <w:r>
+        <w:rPr>
+          <w:rFonts w:ascii="Segoe UI" w:hAnsi="Segoe UI" w:cs="Segoe UI"/>
+          <w:color w:val="000000"/>
+          <w:sz w:val="20"/>
+          <w:szCs w:val="20"/>
+        </w:rPr>
+        <w:fldChar w:fldCharType="end"/>
+      </w:r>
+      <w:r>
+        <w:rPr>
+          <w:rFonts w:ascii="Segoe UI" w:hAnsi="Segoe UI" w:cs="Segoe UI"/>
+          <w:color w:val="000000"/>
+          <w:sz w:val="20"/>
+          <w:szCs w:val="20"/>
+        </w:rPr>
+        <w:t xml:space="preserve"> </w:t>
+      </w:r>
+      <w:r>
+        <w:rPr>
+          <w:rFonts w:ascii="Segoe UI" w:hAnsi="Segoe UI" w:cs="Segoe UI"/>
+          <w:color w:val="000000"/>
+          <w:sz w:val="20"/>
+          <w:szCs w:val="20"/>
+        </w:rPr>
+        <w:t xml:space="preserve">. </w:t>
       </w:r>
     </w:p>
     <w:p>
@@ -3067,6 +3157,7 @@
           <w:szCs w:val="20"/>
           <w:lang w:val="es-ES_tradnl"/>
         </w:rPr>
+        <w:lastRenderedPageBreak/>
         <w:t xml:space="preserve">Reporte con las respuestas a las preguntas del ejercicio 1, 2 y 3. </w:t>
       </w:r>
     </w:p>
@@ -3240,6 +3331,50 @@
           <w:lang w:val="es-ES_tradnl"/>
         </w:rPr>
       </w:pPr>
+    </w:p>
+    <w:p>
+      <w:pPr>
+        <w:jc w:val="both"/>
+        <w:rPr>
+          <w:rFonts w:ascii="Segoe UI" w:hAnsi="Segoe UI" w:cs="Segoe UI"/>
+          <w:b/>
+          <w:bCs/>
+          <w:sz w:val="20"/>
+          <w:szCs w:val="20"/>
+          <w:lang w:val="es-ES_tradnl"/>
+        </w:rPr>
+      </w:pPr>
+      <w:r>
+        <w:rPr>
+          <w:rFonts w:ascii="Segoe UI" w:hAnsi="Segoe UI" w:cs="Segoe UI"/>
+          <w:b/>
+          <w:bCs/>
+          <w:sz w:val="20"/>
+          <w:szCs w:val="20"/>
+          <w:lang w:val="es-ES_tradnl"/>
+        </w:rPr>
+        <w:t>Fecha de entrega</w:t>
+      </w:r>
+      <w:r>
+        <w:rPr>
+          <w:rFonts w:ascii="Segoe UI" w:hAnsi="Segoe UI" w:cs="Segoe UI"/>
+          <w:b/>
+          <w:bCs/>
+          <w:sz w:val="20"/>
+          <w:szCs w:val="20"/>
+          <w:lang w:val="es-ES_tradnl"/>
+        </w:rPr>
+        <w:t xml:space="preserve">: </w:t>
+      </w:r>
+      <w:r>
+        <w:rPr>
+          <w:rFonts w:ascii="Segoe UI" w:hAnsi="Segoe UI" w:cs="Segoe UI"/>
+          <w:sz w:val="20"/>
+          <w:szCs w:val="20"/>
+          <w:lang w:val="es-ES_tradnl"/>
+        </w:rPr>
+        <w:t>3 de septiembre, 2025</w:t>
+      </w:r>
     </w:p>
     <w:p>
       <w:pPr>

</xml_diff>